<commit_message>
Correct manager default username
</commit_message>
<xml_diff>
--- a/FinalProject/README.docx
+++ b/FinalProject/README.docx
@@ -419,7 +419,7 @@
           <w:sz-cs w:val="24"/>
           <w:spacing w:val="0"/>
         </w:rPr>
-        <w:t xml:space="preserve">manager1</w:t>
+        <w:t xml:space="preserve">manager</w:t>
       </w:r>
     </w:p>
     <w:p>
@@ -793,7 +793,7 @@
           <w:sz-cs w:val="24"/>
           <w:spacing w:val="0"/>
         </w:rPr>
-        <w:t xml:space="preserve">Username: manager1</w:t>
+        <w:t xml:space="preserve">Username: manager</w:t>
       </w:r>
     </w:p>
     <w:p>

</xml_diff>